<commit_message>
Some changes to pahse 4 doc
</commit_message>
<xml_diff>
--- a/Phase 4/Phase 4.docx
+++ b/Phase 4/Phase 4.docx
@@ -2,6 +2,70 @@
 <file path=word/document.xml><?xml version="1.0" encoding="utf-8"?>
 <w:document xmlns:wpc="http://schemas.microsoft.com/office/word/2010/wordprocessingCanvas" xmlns:cx="http://schemas.microsoft.com/office/drawing/2014/chartex" xmlns:cx1="http://schemas.microsoft.com/office/drawing/2015/9/8/chartex" xmlns:cx2="http://schemas.microsoft.com/office/drawing/2015/10/21/chartex" xmlns:cx3="http://schemas.microsoft.com/office/drawing/2016/5/9/chartex" xmlns:cx4="http://schemas.microsoft.com/office/drawing/2016/5/10/chartex" xmlns:cx5="http://schemas.microsoft.com/office/drawing/2016/5/11/chartex" xmlns:cx6="http://schemas.microsoft.com/office/drawing/2016/5/12/chartex" xmlns:cx7="http://schemas.microsoft.com/office/drawing/2016/5/13/chartex" xmlns:cx8="http://schemas.microsoft.com/office/drawing/2016/5/14/chartex" xmlns:mc="http://schemas.openxmlformats.org/markup-compatibility/2006" xmlns:aink="http://schemas.microsoft.com/office/drawing/2016/ink" xmlns:am3d="http://schemas.microsoft.com/office/drawing/2017/model3d" xmlns:o="urn:schemas-microsoft-com:office:office" xmlns:oel="http://schemas.microsoft.com/office/2019/extlst" xmlns:r="http://schemas.openxmlformats.org/officeDocument/2006/relationships" xmlns:m="http://schemas.openxmlformats.org/officeDocument/2006/math" xmlns:v="urn:schemas-microsoft-com:vml" xmlns:wp14="http://schemas.microsoft.com/office/word/2010/wordprocessingDrawing" xmlns:wp="http://schemas.openxmlformats.org/drawingml/2006/wordprocessingDrawing" xmlns:w10="urn:schemas-microsoft-com:office:word" xmlns:w="http://schemas.openxmlformats.org/wordprocessingml/2006/main" xmlns:w14="http://schemas.microsoft.com/office/word/2010/wordml" xmlns:w15="http://schemas.microsoft.com/office/word/2012/wordml" xmlns:w16cex="http://schemas.microsoft.com/office/word/2018/wordml/cex" xmlns:w16cid="http://schemas.microsoft.com/office/word/2016/wordml/cid" xmlns:w16="http://schemas.microsoft.com/office/word/2018/wordml" xmlns:w16du="http://schemas.microsoft.com/office/word/2023/wordml/word16du" xmlns:w16sdtdh="http://schemas.microsoft.com/office/word/2020/wordml/sdtdatahash" xmlns:w16sdtfl="http://schemas.microsoft.com/office/word/2024/wordml/sdtformatlock" xmlns:w16se="http://schemas.microsoft.com/office/word/2015/wordml/symex" xmlns:wpg="http://schemas.microsoft.com/office/word/2010/wordprocessingGroup" xmlns:wpi="http://schemas.microsoft.com/office/word/2010/wordprocessingInk" xmlns:wne="http://schemas.microsoft.com/office/word/2006/wordml" xmlns:wps="http://schemas.microsoft.com/office/word/2010/wordprocessingShape" mc:Ignorable="w14 w15 w16se w16cid w16 w16cex w16sdtdh w16sdtfl w16du wp14">
   <w:body>
+    <w:p>
+      <w:r>
+        <w:t>Machine Learning Model:</w:t>
+      </w:r>
+    </w:p>
+    <w:p>
+      <w:r>
+        <w:t xml:space="preserve">The initial proposal was to use Naïve Bayes to predict diabetes due to its </w:t>
+      </w:r>
+      <w:r>
+        <w:t xml:space="preserve">naturally high recall. However, after further guidance and deliberations, multiple changes have been made. First, we opted to </w:t>
+      </w:r>
+      <w:r>
+        <w:t>modify the dataset further by implementing binning on the BMI column and we split the categories based on the different BMI classifications on the CDC’s website</w:t>
+      </w:r>
+      <w:r>
+        <w:t xml:space="preserve">. The dataset was already extracted from CDC </w:t>
+      </w:r>
+      <w:r>
+        <w:t>surveys,</w:t>
+      </w:r>
+      <w:r>
+        <w:t xml:space="preserve"> so the binning is consistent with the source</w:t>
+      </w:r>
+      <w:r>
+        <w:t>. Second, we opted to use shallower networks with a decreasing number of nodes per layer</w:t>
+      </w:r>
+      <w:r>
+        <w:t>. We combined that with focal loss to reduce the effect of uneven data distribution on the model’s training</w:t>
+      </w:r>
+      <w:r>
+        <w:t>.</w:t>
+      </w:r>
+      <w:r>
+        <w:t xml:space="preserve"> We utilized grid search in order to </w:t>
+      </w:r>
+      <w:r>
+        <w:t>find the optimal parameters for the model</w:t>
+      </w:r>
+      <w:r>
+        <w:t xml:space="preserve"> to maximize recall due to the medical nature of his application</w:t>
+      </w:r>
+      <w:r>
+        <w:t xml:space="preserve"> prioritizing detecting true positives over having high precision. Grid search was</w:t>
+      </w:r>
+      <w:r>
+        <w:t xml:space="preserve"> done</w:t>
+      </w:r>
+      <w:r>
+        <w:t xml:space="preserve"> over</w:t>
+      </w:r>
+      <w:r>
+        <w:t xml:space="preserve"> 50 trials for</w:t>
+      </w:r>
+      <w:r>
+        <w:t xml:space="preserve"> 50 epochs</w:t>
+      </w:r>
+      <w:r>
+        <w:t xml:space="preserve"> each trial</w:t>
+      </w:r>
+      <w:r>
+        <w:t>.</w:t>
+      </w:r>
+    </w:p>
     <w:p>
       <w:r>
         <w:t>Application Architecture:</w:t>
@@ -68,15 +132,7 @@
         <w:t>Our application</w:t>
       </w:r>
       <w:r>
-        <w:t xml:space="preserve"> is separated into 2 parts. The first part is the front </w:t>
-      </w:r>
-      <w:proofErr w:type="gramStart"/>
-      <w:r>
-        <w:t>end</w:t>
-      </w:r>
-      <w:proofErr w:type="gramEnd"/>
-      <w:r>
-        <w:t xml:space="preserve"> and the second part is the back end</w:t>
+        <w:t xml:space="preserve"> is separated into 2 parts. The first part is the front end and the second part is the back end</w:t>
       </w:r>
       <w:r>
         <w:t>.</w:t>
@@ -116,7 +172,11 @@
         <w:t xml:space="preserve"> for most fields since the fields are binary. For the non-binary fields, they will be made to insert a number with a certain range that depends on the nature of the question</w:t>
       </w:r>
       <w:r>
-        <w:t xml:space="preserve"> like general health rating, number of days where you felt physically unwell, BMI, etc.</w:t>
+        <w:t xml:space="preserve"> like general health rating, </w:t>
+      </w:r>
+      <w:r>
+        <w:lastRenderedPageBreak/>
+        <w:t>number of days where you felt physically unwell, BMI, etc.</w:t>
       </w:r>
       <w:r>
         <w:t xml:space="preserve"> For</w:t>
@@ -171,15 +231,7 @@
         <w:t xml:space="preserve"> The data is then </w:t>
       </w:r>
       <w:r>
-        <w:t xml:space="preserve">used by the model to predict </w:t>
-      </w:r>
-      <w:proofErr w:type="gramStart"/>
-      <w:r>
-        <w:t>whether or not</w:t>
-      </w:r>
-      <w:proofErr w:type="gramEnd"/>
-      <w:r>
-        <w:t xml:space="preserve"> the user has diabetes based on the data sent. The prediction is sent as another JSON object to the user through an API call and the user receives their prediction.</w:t>
+        <w:t>used by the model to predict whether or not the user has diabetes based on the data sent. The prediction is sent as another JSON object to the user through an API call and the user receives their prediction.</w:t>
       </w:r>
     </w:p>
     <w:sectPr>

</xml_diff>

<commit_message>
API version 2 and final phase 4 document
</commit_message>
<xml_diff>
--- a/Phase 4/Phase 4.docx
+++ b/Phase 4/Phase 4.docx
@@ -490,25 +490,39 @@
           <w:szCs w:val="28"/>
           <w14:ligatures w14:val="standard"/>
         </w:rPr>
-        <w:t xml:space="preserve">diabetes due to its naturally high recall. However, after further guidance and deliberations, multiple changes have been made. First, we opted to modify the dataset further by implementing binning on the BMI column and we split the categories based on the different BMI classifications on the CDC’s website. The dataset was already extracted from CDC surveys, so the binning is consistent with the source. Second, we opted to use shallower networks with a decreasing number of nodes per layer. We combined that with focal loss to reduce the effect of uneven data distribution on the model’s training. We utilized grid search </w:t>
-      </w:r>
-      <w:proofErr w:type="gramStart"/>
+        <w:t>diabetes due to its naturally high recall. However, after further guidance and deliberations, multiple changes have been made. First, we opted to modify the dataset further by implementing binning on the BMI column and we split the categories based on the different BMI classifications on the CDC’s website. The dataset was already extracted from CDC surveys, so the binning is consistent with the source.</w:t>
+      </w:r>
       <w:r>
         <w:rPr>
           <w:sz w:val="20"/>
           <w:szCs w:val="28"/>
           <w14:ligatures w14:val="standard"/>
         </w:rPr>
-        <w:t>in order to</w:t>
-      </w:r>
-      <w:proofErr w:type="gramEnd"/>
+        <w:t xml:space="preserve"> Additionally, it seemed to improve </w:t>
+      </w:r>
       <w:r>
         <w:rPr>
           <w:sz w:val="20"/>
           <w:szCs w:val="28"/>
           <w14:ligatures w14:val="standard"/>
         </w:rPr>
-        <w:t xml:space="preserve"> find the optimal parameters for the model to maximize recall due to the medical nature of his application prioritizing detecting true positives over having high precision. Grid search was done over 50 trials for 50 epochs each trial. The parameters are as follows:</w:t>
+        <w:t>the performance</w:t>
+      </w:r>
+      <w:r>
+        <w:rPr>
+          <w:sz w:val="20"/>
+          <w:szCs w:val="28"/>
+          <w14:ligatures w14:val="standard"/>
+        </w:rPr>
+        <w:t xml:space="preserve"> of the neural network.</w:t>
+      </w:r>
+      <w:r>
+        <w:rPr>
+          <w:sz w:val="20"/>
+          <w:szCs w:val="28"/>
+          <w14:ligatures w14:val="standard"/>
+        </w:rPr>
+        <w:t xml:space="preserve"> Second, we opted to use shallower networks with a decreasing number of nodes per layer. We combined that with focal loss to reduce the effect of uneven data distribution on the model’s training. We utilized grid search in order to find the optimal parameters for the model to maximize recall due to the medical nature of his application prioritizing detecting true positives over having high precision. Grid search was done over 50 trials for 50 epochs each trial. The parameters are as follows:</w:t>
       </w:r>
     </w:p>
     <w:p>
@@ -629,6 +643,70 @@
         <w:t>Each dense node is as we studied ANNs in class, completely connected to all prior nodes. The dropout nodes, however, drop some of the connections to avoid overfitting.</w:t>
       </w:r>
     </w:p>
+    <w:p>
+      <w:pPr>
+        <w:rPr>
+          <w:sz w:val="20"/>
+          <w:szCs w:val="20"/>
+        </w:rPr>
+      </w:pPr>
+      <w:r>
+        <w:rPr>
+          <w:sz w:val="20"/>
+          <w:szCs w:val="20"/>
+        </w:rPr>
+        <w:t xml:space="preserve">The </w:t>
+      </w:r>
+      <w:r>
+        <w:rPr>
+          <w:sz w:val="20"/>
+          <w:szCs w:val="20"/>
+        </w:rPr>
+        <w:t>advantage</w:t>
+      </w:r>
+      <w:r>
+        <w:rPr>
+          <w:sz w:val="20"/>
+          <w:szCs w:val="20"/>
+        </w:rPr>
+        <w:t xml:space="preserve"> of choosing a neural network is that it was one of the better performing </w:t>
+      </w:r>
+      <w:r>
+        <w:rPr>
+          <w:sz w:val="20"/>
+          <w:szCs w:val="20"/>
+        </w:rPr>
+        <w:t xml:space="preserve">approaches and that its feed forward and backpropagation system helps account for </w:t>
+      </w:r>
+      <w:r>
+        <w:rPr>
+          <w:sz w:val="20"/>
+          <w:szCs w:val="20"/>
+        </w:rPr>
+        <w:t>different data instances. Furthermore, the ability to use focal loss helps eliminate the issue</w:t>
+      </w:r>
+      <w:r>
+        <w:rPr>
+          <w:sz w:val="20"/>
+          <w:szCs w:val="20"/>
+        </w:rPr>
+        <w:t xml:space="preserve"> of the minority class being ignored. On the other hand, it is more complex to </w:t>
+      </w:r>
+      <w:r>
+        <w:rPr>
+          <w:sz w:val="20"/>
+          <w:szCs w:val="20"/>
+        </w:rPr>
+        <w:t>build</w:t>
+      </w:r>
+      <w:r>
+        <w:rPr>
+          <w:sz w:val="20"/>
+          <w:szCs w:val="20"/>
+        </w:rPr>
+        <w:t xml:space="preserve"> and train compared to other machine learning approaches.</w:t>
+      </w:r>
+    </w:p>
     <w:p/>
     <w:p>
       <w:pPr>
@@ -845,7 +923,15 @@
           <w:sz w:val="20"/>
           <w:szCs w:val="20"/>
         </w:rPr>
-        <w:t xml:space="preserve"> and income inputs, they will select from a drop-down menu the range they fall under.</w:t>
+        <w:t xml:space="preserve"> and income inputs, </w:t>
+      </w:r>
+      <w:r>
+        <w:rPr>
+          <w:sz w:val="20"/>
+          <w:szCs w:val="20"/>
+        </w:rPr>
+        <w:lastRenderedPageBreak/>
+        <w:t>they will select from a drop-down menu the range they fall under.</w:t>
       </w:r>
     </w:p>
     <w:p>
@@ -884,6 +970,13 @@
         </w:rPr>
         <w:t>. The data is then sent as a JSON object to the model’s backend using an API call.</w:t>
       </w:r>
+      <w:r>
+        <w:rPr>
+          <w:sz w:val="20"/>
+          <w:szCs w:val="20"/>
+        </w:rPr>
+        <w:t xml:space="preserve"> When the prediction is received, it is displayed to the user.</w:t>
+      </w:r>
     </w:p>
     <w:p>
       <w:pPr>
@@ -922,64 +1015,77 @@
           <w:sz w:val="20"/>
           <w:szCs w:val="20"/>
         </w:rPr>
-        <w:t xml:space="preserve">Flask API will handle incoming </w:t>
+        <w:t>Flask API will handle incoming prediction requests.</w:t>
       </w:r>
       <w:r>
         <w:rPr>
           <w:sz w:val="20"/>
           <w:szCs w:val="20"/>
         </w:rPr>
-        <w:lastRenderedPageBreak/>
-        <w:t>prediction requests.</w:t>
+        <w:t xml:space="preserve"> </w:t>
       </w:r>
       <w:r>
         <w:rPr>
           <w:sz w:val="20"/>
           <w:szCs w:val="20"/>
         </w:rPr>
-        <w:t xml:space="preserve"> </w:t>
+        <w:t>D</w:t>
       </w:r>
       <w:r>
         <w:rPr>
           <w:sz w:val="20"/>
           <w:szCs w:val="20"/>
         </w:rPr>
-        <w:t>D</w:t>
+        <w:t xml:space="preserve">ata </w:t>
       </w:r>
       <w:r>
         <w:rPr>
           <w:sz w:val="20"/>
           <w:szCs w:val="20"/>
         </w:rPr>
-        <w:t xml:space="preserve">ata </w:t>
+        <w:t xml:space="preserve">will be validated in the backend as well </w:t>
       </w:r>
       <w:r>
         <w:rPr>
           <w:sz w:val="20"/>
           <w:szCs w:val="20"/>
         </w:rPr>
-        <w:t xml:space="preserve">will be validated in the backend as well </w:t>
+        <w:t xml:space="preserve">just in case it got corrupted or tampered with during transfer. If the data is faulty, a return API call is sent to indicate an issue. The data is then used by the model to predict </w:t>
       </w:r>
       <w:r>
         <w:rPr>
           <w:sz w:val="20"/>
           <w:szCs w:val="20"/>
         </w:rPr>
-        <w:t xml:space="preserve">just in case it got corrupted or tampered with during transfer. If the data is faulty, a return API call is sent to indicate an issue. The data is then used by the model to predict </w:t>
+        <w:t>whether</w:t>
       </w:r>
       <w:r>
         <w:rPr>
           <w:sz w:val="20"/>
           <w:szCs w:val="20"/>
         </w:rPr>
-        <w:t>whether</w:t>
+        <w:t xml:space="preserve"> the user has diabetes based on the data sent. The prediction is sent as another JSON object to the user through an API call and the user receives their prediction.</w:t>
       </w:r>
       <w:r>
         <w:rPr>
           <w:sz w:val="20"/>
           <w:szCs w:val="20"/>
         </w:rPr>
-        <w:t xml:space="preserve"> the user has diabetes based on the data sent. The prediction is sent as another JSON object to the user through an API call and the user receives their prediction.</w:t>
+        <w:t xml:space="preserve"> The </w:t>
+      </w:r>
+      <w:r>
+        <w:rPr>
+          <w:sz w:val="20"/>
+          <w:szCs w:val="20"/>
+        </w:rPr>
+        <w:t xml:space="preserve">input data and prediction are saved on the back end </w:t>
+      </w:r>
+      <w:r>
+        <w:rPr>
+          <w:sz w:val="20"/>
+          <w:szCs w:val="20"/>
+        </w:rPr>
+        <w:t>and after every 10 predictions, the model is retrained on the collective data, both new and old. The data collected from user input is saved in a separate csv file.</w:t>
       </w:r>
     </w:p>
     <w:p/>
@@ -1146,28 +1252,12 @@
             </w:rPr>
             <w:t xml:space="preserve">. </w:t>
           </w:r>
-          <w:proofErr w:type="spellStart"/>
           <w:r>
             <w:rPr>
               <w:rFonts w:ascii="Linux Biolinum" w:hAnsi="Linux Biolinum" w:cs="Linux Biolinum"/>
             </w:rPr>
-            <w:t>ElAnsary</w:t>
+            <w:t>ElAnsary &amp; M. AbdalRaaof</w:t>
           </w:r>
-          <w:proofErr w:type="spellEnd"/>
-          <w:r>
-            <w:rPr>
-              <w:rFonts w:ascii="Linux Biolinum" w:hAnsi="Linux Biolinum" w:cs="Linux Biolinum"/>
-            </w:rPr>
-            <w:t xml:space="preserve"> &amp; M. </w:t>
-          </w:r>
-          <w:proofErr w:type="spellStart"/>
-          <w:r>
-            <w:rPr>
-              <w:rFonts w:ascii="Linux Biolinum" w:hAnsi="Linux Biolinum" w:cs="Linux Biolinum"/>
-            </w:rPr>
-            <w:t>AbdalRaaof</w:t>
-          </w:r>
-          <w:proofErr w:type="spellEnd"/>
         </w:p>
       </w:tc>
     </w:tr>
@@ -1246,28 +1336,12 @@
             </w:rPr>
             <w:t xml:space="preserve">. </w:t>
           </w:r>
-          <w:proofErr w:type="spellStart"/>
           <w:r>
             <w:rPr>
               <w:rFonts w:ascii="Linux Biolinum" w:hAnsi="Linux Biolinum" w:cs="Linux Biolinum"/>
             </w:rPr>
-            <w:t>ElAnsary</w:t>
+            <w:t>ElAnsary &amp; M. AbdalRaaof</w:t>
           </w:r>
-          <w:proofErr w:type="spellEnd"/>
-          <w:r>
-            <w:rPr>
-              <w:rFonts w:ascii="Linux Biolinum" w:hAnsi="Linux Biolinum" w:cs="Linux Biolinum"/>
-            </w:rPr>
-            <w:t xml:space="preserve"> &amp; M. </w:t>
-          </w:r>
-          <w:proofErr w:type="spellStart"/>
-          <w:r>
-            <w:rPr>
-              <w:rFonts w:ascii="Linux Biolinum" w:hAnsi="Linux Biolinum" w:cs="Linux Biolinum"/>
-            </w:rPr>
-            <w:t>AbdalRaaof</w:t>
-          </w:r>
-          <w:proofErr w:type="spellEnd"/>
         </w:p>
       </w:tc>
     </w:tr>
@@ -10011,10 +10085,6 @@
 </file>
 
 <file path=customXml/item1.xml><?xml version="1.0" encoding="utf-8"?>
-<b:Sources xmlns:b="http://schemas.openxmlformats.org/officeDocument/2006/bibliography" xmlns="http://schemas.openxmlformats.org/officeDocument/2006/bibliography" SelectedStyle="\APA.XSL" StyleName="APA"/>
-</file>
-
-<file path=customXml/item2.xml><?xml version="1.0" encoding="utf-8"?>
 <Workflow version="v.1.13">
   <Filtration versionrequired="True" status="DONE" StartTime="25-07-2014 13:27:04" EndTime="25-07-2014 13:28:29">
     <Mandatory>
@@ -10192,16 +10262,20 @@
 </Workflow>
 </file>
 
+<file path=customXml/item2.xml><?xml version="1.0" encoding="utf-8"?>
+<b:Sources xmlns:b="http://schemas.openxmlformats.org/officeDocument/2006/bibliography" xmlns="http://schemas.openxmlformats.org/officeDocument/2006/bibliography" SelectedStyle="\APA.XSL" StyleName="APA"/>
+</file>
+
 <file path=customXml/itemProps1.xml><?xml version="1.0" encoding="utf-8"?>
+<ds:datastoreItem xmlns:ds="http://schemas.openxmlformats.org/officeDocument/2006/customXml" ds:itemID="{4D45DBA2-DCF6-46BF-858B-9A8CC8161B4D}">
+  <ds:schemaRefs/>
+</ds:datastoreItem>
+</file>
+
+<file path=customXml/itemProps2.xml><?xml version="1.0" encoding="utf-8"?>
 <ds:datastoreItem xmlns:ds="http://schemas.openxmlformats.org/officeDocument/2006/customXml" ds:itemID="{B589180B-96F4-4B3D-93D7-E2C64345EF74}">
   <ds:schemaRefs>
     <ds:schemaRef ds:uri="http://schemas.openxmlformats.org/officeDocument/2006/bibliography"/>
   </ds:schemaRefs>
 </ds:datastoreItem>
-</file>
-
-<file path=customXml/itemProps2.xml><?xml version="1.0" encoding="utf-8"?>
-<ds:datastoreItem xmlns:ds="http://schemas.openxmlformats.org/officeDocument/2006/customXml" ds:itemID="{4D45DBA2-DCF6-46BF-858B-9A8CC8161B4D}">
-  <ds:schemaRefs/>
-</ds:datastoreItem>
 </file>
</xml_diff>